<commit_message>
Atualiza avaliação de Geografia 3º ano conforme conteúdo do livro
Alinha questões às páginas sobre frevo, etnia, elementos culturais e
cultura entre gerações. Mantém 4 objetivas e 6 dissertativas em Word.

Co-authored-by: Leonardo Brum <leonardobrum.dev@gmail.com>
</commit_message>
<xml_diff>
--- a/Avaliacao_Geografia_3ano.docx
+++ b/Avaliacao_Geografia_3ano.docx
@@ -42,7 +42,7 @@
           <w:color w:val="4B5563"/>
           <w:sz w:val="20"/>
         </w:rPr>
-        <w:t>Lugares de vivência • O que é cultura • Cultura entre gerações • Cultura brasileira urbana</w:t>
+        <w:t>Festas populares • Etnia e cultura • Elementos culturais • Cultura através das gerações</w:t>
       </w:r>
     </w:p>
     <w:p>
@@ -99,7 +99,7 @@
           <w:color w:val="1F2937"/>
           <w:sz w:val="20"/>
         </w:rPr>
-        <w:t>• Observe as imagens — elas ajudam na resposta.</w:t>
+        <w:t>• Observe as imagens — elas remetem aos conteúdos estudados no livro.</w:t>
       </w:r>
     </w:p>
     <w:p>
@@ -141,7 +141,7 @@
           <w:color w:val="1F2937"/>
           <w:sz w:val="20"/>
         </w:rPr>
-        <w:t>• Avaliação de dificuldade média — valor total: 10 pontos (1 ponto por questão).</w:t>
+        <w:t>• Dificuldade média — valor total: 10 pontos (1 ponto por questão).</w:t>
       </w:r>
     </w:p>
     <w:p>
@@ -184,7 +184,7 @@
           <w:color w:val="1B5E20"/>
           <w:sz w:val="22"/>
         </w:rPr>
-        <w:t>Questão 1 — Lugares de vivência</w:t>
+        <w:t>Questão 1 — Festas populares e frevo</w:t>
       </w:r>
     </w:p>
     <w:p>
@@ -198,7 +198,7 @@
           <w:color w:val="1F2937"/>
           <w:sz w:val="22"/>
         </w:rPr>
-        <w:t>Observe a imagem abaixo. Qual alternativa descreve melhor um lugar de vivência?</w:t>
+        <w:t>Observe a imagem. A dança representada é o frevo, uma festa popular de rua. Sobre essa manifestação cultural, assinale a alternativa correta:</w:t>
       </w:r>
     </w:p>
     <w:p>
@@ -208,7 +208,7 @@
       <w:r>
         <w:drawing>
           <wp:inline xmlns:a="http://schemas.openxmlformats.org/drawingml/2006/main" xmlns:pic="http://schemas.openxmlformats.org/drawingml/2006/picture">
-            <wp:extent cx="3960000" cy="2970000"/>
+            <wp:extent cx="3960000" cy="2640000"/>
             <wp:docPr id="1" name="Picture 1"/>
             <wp:cNvGraphicFramePr>
               <a:graphicFrameLocks noChangeAspect="1"/>
@@ -229,7 +229,7 @@
                   <pic:spPr>
                     <a:xfrm>
                       <a:off x="0" y="0"/>
-                      <a:ext cx="3960000" cy="2970000"/>
+                      <a:ext cx="3960000" cy="2640000"/>
                     </a:xfrm>
                     <a:prstGeom prst="rect"/>
                   </pic:spPr>
@@ -252,7 +252,7 @@
           <w:color w:val="4B5563"/>
           <w:sz w:val="18"/>
         </w:rPr>
-        <w:t>Bairro residencial em Minas Gerais.</w:t>
+        <w:t>Passistas de frevo no Carnaval do Recife, Pernambuco.</w:t>
       </w:r>
     </w:p>
     <w:tbl>
@@ -489,7 +489,7 @@
           <w:color w:val="1F2937"/>
           <w:sz w:val="22"/>
         </w:rPr>
-        <w:t>A) Um local onde vivemos, convivemos e realizamos atividades do dia a dia.</w:t>
+        <w:t>A) O frevo é uma dança que se originou em Pernambuco e faz parte das festas populares brasileiras.</w:t>
       </w:r>
     </w:p>
     <w:p>
@@ -512,7 +512,7 @@
           <w:color w:val="1F2937"/>
           <w:sz w:val="22"/>
         </w:rPr>
-        <w:t>B) Apenas lugares turísticos visitados nas férias.</w:t>
+        <w:t>B) O frevo é uma dança que existe apenas em países europeus.</w:t>
       </w:r>
     </w:p>
     <w:p>
@@ -535,7 +535,7 @@
           <w:color w:val="1F2937"/>
           <w:sz w:val="22"/>
         </w:rPr>
-        <w:t>C) Somente a escola, pois é onde aprendemos.</w:t>
+        <w:t>C) O frevo não é considerado manifestação cultural porque acontece na rua.</w:t>
       </w:r>
     </w:p>
     <w:p>
@@ -558,7 +558,7 @@
           <w:color w:val="1F2937"/>
           <w:sz w:val="22"/>
         </w:rPr>
-        <w:t>D) Lugares que existem apenas em mapas e atlas.</w:t>
+        <w:t>D) O frevo é igual em todas as cidades do mundo.</w:t>
       </w:r>
     </w:p>
     <w:p/>
@@ -573,7 +573,7 @@
           <w:color w:val="1B5E20"/>
           <w:sz w:val="22"/>
         </w:rPr>
-        <w:t>Questão 2 — O que é cultura</w:t>
+        <w:t>Questão 2 — Etnia e cultura</w:t>
       </w:r>
     </w:p>
     <w:p>
@@ -587,7 +587,7 @@
           <w:color w:val="1F2937"/>
           <w:sz w:val="22"/>
         </w:rPr>
-        <w:t>Cultura é o conjunto de costumes, festas, comidas, músicas e formas de viver de um grupo de pessoas. Qual item NÃO representa um elemento cultural?</w:t>
+        <w:t>Segundo o livro, etnia é uma comunidade formada por pessoas que compartilham elementos comuns. Observe a imagem e marque a alternativa correta sobre cultura:</w:t>
       </w:r>
     </w:p>
     <w:p>
@@ -597,7 +597,7 @@
       <w:r>
         <w:drawing>
           <wp:inline xmlns:a="http://schemas.openxmlformats.org/drawingml/2006/main" xmlns:pic="http://schemas.openxmlformats.org/drawingml/2006/picture">
-            <wp:extent cx="3960000" cy="2970000"/>
+            <wp:extent cx="3960000" cy="6554625"/>
             <wp:docPr id="2" name="Picture 2"/>
             <wp:cNvGraphicFramePr>
               <a:graphicFrameLocks noChangeAspect="1"/>
@@ -618,7 +618,7 @@
                   <pic:spPr>
                     <a:xfrm>
                       <a:off x="0" y="0"/>
-                      <a:ext cx="3960000" cy="2970000"/>
+                      <a:ext cx="3960000" cy="6554625"/>
                     </a:xfrm>
                     <a:prstGeom prst="rect"/>
                   </pic:spPr>
@@ -641,7 +641,7 @@
           <w:color w:val="4B5563"/>
           <w:sz w:val="18"/>
         </w:rPr>
-        <w:t>Festa junina com dança de crianças.</w:t>
+        <w:t>Traje tradicional inuit — exemplo de identidade cultural.</w:t>
       </w:r>
     </w:p>
     <w:tbl>
@@ -878,7 +878,7 @@
           <w:color w:val="1F2937"/>
           <w:sz w:val="22"/>
         </w:rPr>
-        <w:t>A) Preparar comidas típicas da região em datas especiais.</w:t>
+        <w:t>A) Todas as culturas são iguais e não apresentam diferenças.</w:t>
       </w:r>
     </w:p>
     <w:p>
@@ -901,7 +901,7 @@
           <w:color w:val="1F2937"/>
           <w:sz w:val="22"/>
         </w:rPr>
-        <w:t>B) Celebrar festas tradicionais com danças e músicas.</w:t>
+        <w:t>B) Algumas culturas são melhores que outras.</w:t>
       </w:r>
     </w:p>
     <w:p>
@@ -924,7 +924,7 @@
           <w:color w:val="1F2937"/>
           <w:sz w:val="22"/>
         </w:rPr>
-        <w:t>C) A altura de uma montanha medida em metros.</w:t>
+        <w:t>C) Existem culturas diferentes, e nenhuma é melhor ou pior — são apenas diferentes.</w:t>
       </w:r>
     </w:p>
     <w:p>
@@ -947,7 +947,7 @@
           <w:color w:val="1F2937"/>
           <w:sz w:val="22"/>
         </w:rPr>
-        <w:t>D) Contar histórias passadas de pais para filhos.</w:t>
+        <w:t>D) A cultura existe apenas nas grandes cidades.</w:t>
       </w:r>
     </w:p>
     <w:p/>
@@ -962,7 +962,7 @@
           <w:color w:val="1B5E20"/>
           <w:sz w:val="22"/>
         </w:rPr>
-        <w:t>Questão 3 — Cultura entre gerações</w:t>
+        <w:t>Questão 3 — O que é cultura</w:t>
       </w:r>
     </w:p>
     <w:p>
@@ -976,7 +976,7 @@
           <w:color w:val="1F2937"/>
           <w:sz w:val="22"/>
         </w:rPr>
-        <w:t>Observe a imagem com pessoas de idades diferentes. Por que a cultura pode ser diferente entre avós, pais e crianças?</w:t>
+        <w:t>O livro apresenta crenças, expressões artísticas, costumes e leis como parte da cultura. Qual alternativa representa uma expressão artística?</w:t>
       </w:r>
     </w:p>
     <w:p>
@@ -986,7 +986,7 @@
       <w:r>
         <w:drawing>
           <wp:inline xmlns:a="http://schemas.openxmlformats.org/drawingml/2006/main" xmlns:pic="http://schemas.openxmlformats.org/drawingml/2006/picture">
-            <wp:extent cx="3960000" cy="5940000"/>
+            <wp:extent cx="3960000" cy="2227500"/>
             <wp:docPr id="3" name="Picture 3"/>
             <wp:cNvGraphicFramePr>
               <a:graphicFrameLocks noChangeAspect="1"/>
@@ -1007,7 +1007,7 @@
                   <pic:spPr>
                     <a:xfrm>
                       <a:off x="0" y="0"/>
-                      <a:ext cx="3960000" cy="5940000"/>
+                      <a:ext cx="3960000" cy="2227500"/>
                     </a:xfrm>
                     <a:prstGeom prst="rect"/>
                   </pic:spPr>
@@ -1030,7 +1030,7 @@
           <w:color w:val="4B5563"/>
           <w:sz w:val="18"/>
         </w:rPr>
-        <w:t>Três gerações de uma mesma família.</w:t>
+        <w:t>Crianças cantando e tocando instrumento musical.</w:t>
       </w:r>
     </w:p>
     <w:tbl>
@@ -1267,7 +1267,7 @@
           <w:color w:val="1F2937"/>
           <w:sz w:val="22"/>
         </w:rPr>
-        <w:t>A) Porque cada geração vive em épocas e contextos distintos.</w:t>
+        <w:t>A) Respeitar as leis de trânsito ao atravessar a rua.</w:t>
       </w:r>
     </w:p>
     <w:p>
@@ -1290,7 +1290,7 @@
           <w:color w:val="1F2937"/>
           <w:sz w:val="22"/>
         </w:rPr>
-        <w:t>B) Porque apenas os avós têm cultura de verdade.</w:t>
+        <w:t>B) Almoçar em família ao redor da mesa.</w:t>
       </w:r>
     </w:p>
     <w:p>
@@ -1313,7 +1313,7 @@
           <w:color w:val="1F2937"/>
           <w:sz w:val="22"/>
         </w:rPr>
-        <w:t>C) Porque crianças não participam de nenhuma tradição.</w:t>
+        <w:t>C) Cantar e tocar instrumentos musicais.</w:t>
       </w:r>
     </w:p>
     <w:p>
@@ -1336,7 +1336,7 @@
           <w:color w:val="1F2937"/>
           <w:sz w:val="22"/>
         </w:rPr>
-        <w:t>D) Porque a cultura nunca muda de uma geração para outra.</w:t>
+        <w:t>D) Acreditar em ideias e tradições religiosas.</w:t>
       </w:r>
     </w:p>
     <w:p/>
@@ -1351,7 +1351,7 @@
           <w:color w:val="1B5E20"/>
           <w:sz w:val="22"/>
         </w:rPr>
-        <w:t>Questão 4 — Cultura brasileira urbana</w:t>
+        <w:t>Questão 4 — Cultura através das gerações</w:t>
       </w:r>
     </w:p>
     <w:p>
@@ -1365,7 +1365,7 @@
           <w:color w:val="1F2937"/>
           <w:sz w:val="22"/>
         </w:rPr>
-        <w:t>Observe a imagem de arte urbana. Esse tipo de manifestação cultural é comum em cidades brasileiras porque:</w:t>
+        <w:t>Observe a imagem. Qual brincadeira está sendo representada e como ela se relaciona com a cultura?</w:t>
       </w:r>
     </w:p>
     <w:p>
@@ -1419,7 +1419,7 @@
           <w:color w:val="4B5563"/>
           <w:sz w:val="18"/>
         </w:rPr>
-        <w:t>Grafite na Avenida Paulista, São Paulo.</w:t>
+        <w:t>Crianças brincando ao ar livre — transmissão cultural entre gerações.</w:t>
       </w:r>
     </w:p>
     <w:tbl>
@@ -1656,7 +1656,7 @@
           <w:color w:val="1F2937"/>
           <w:sz w:val="22"/>
         </w:rPr>
-        <w:t>A) Só existe em países frios, longe do Brasil.</w:t>
+        <w:t>A) Amarelinha; é uma brincadeira que não muda nunca.</w:t>
       </w:r>
     </w:p>
     <w:p>
@@ -1679,7 +1679,7 @@
           <w:color w:val="1F2937"/>
           <w:sz w:val="22"/>
         </w:rPr>
-        <w:t>B) Expressa identidade, criatividade e vida nas cidades.</w:t>
+        <w:t>B) Esconde-esconde; é uma brincadeira aprendida e transmitida entre pessoas de diferentes idades.</w:t>
       </w:r>
     </w:p>
     <w:p>
@@ -1702,7 +1702,7 @@
           <w:color w:val="1F2937"/>
           <w:sz w:val="22"/>
         </w:rPr>
-        <w:t>C) Não tem relação com a cultura local.</w:t>
+        <w:t>C) Videogame; só existe na cultura dos adultos.</w:t>
       </w:r>
     </w:p>
     <w:p>
@@ -1725,7 +1725,7 @@
           <w:color w:val="1F2937"/>
           <w:sz w:val="22"/>
         </w:rPr>
-        <w:t>D) Substitui completamente todas as outras tradições.</w:t>
+        <w:t>D) Futebol; não faz parte da cultura infantil.</w:t>
       </w:r>
     </w:p>
     <w:p/>
@@ -1759,7 +1759,7 @@
           <w:color w:val="1B5E20"/>
           <w:sz w:val="22"/>
         </w:rPr>
-        <w:t>Questão 5 — Lugares de vivência</w:t>
+        <w:t>Questão 5 — Festas populares</w:t>
       </w:r>
     </w:p>
     <w:p>
@@ -1773,7 +1773,7 @@
           <w:color w:val="1F2937"/>
           <w:sz w:val="22"/>
         </w:rPr>
-        <w:t>Pedro acorda em casa, toma café, vai à escola, brinca na praça depois das aulas e ajuda a mãe no mercado. Cite três lugares de vivência presentes nessa rotina e explique por que a escola também é um lugar de vivência.</w:t>
+        <w:t>O que é uma festa popular? Explique usando o frevo como exemplo. Informe em qual estado brasileiro essa dança se originou e descreva dois elementos visíveis na imagem (como roupa, sombrinha ou movimento).</w:t>
       </w:r>
     </w:p>
     <w:p>
@@ -1783,7 +1783,7 @@
       <w:r>
         <w:drawing>
           <wp:inline xmlns:a="http://schemas.openxmlformats.org/drawingml/2006/main" xmlns:pic="http://schemas.openxmlformats.org/drawingml/2006/picture">
-            <wp:extent cx="3960000" cy="2970000"/>
+            <wp:extent cx="3960000" cy="2640000"/>
             <wp:docPr id="5" name="Picture 5"/>
             <wp:cNvGraphicFramePr>
               <a:graphicFrameLocks noChangeAspect="1"/>
@@ -1796,7 +1796,7 @@
                     <pic:cNvPicPr/>
                   </pic:nvPicPr>
                   <pic:blipFill>
-                    <a:blip r:embed="rId13"/>
+                    <a:blip r:embed="rId9"/>
                     <a:stretch>
                       <a:fillRect/>
                     </a:stretch>
@@ -1804,7 +1804,7 @@
                   <pic:spPr>
                     <a:xfrm>
                       <a:off x="0" y="0"/>
-                      <a:ext cx="3960000" cy="2970000"/>
+                      <a:ext cx="3960000" cy="2640000"/>
                     </a:xfrm>
                     <a:prstGeom prst="rect"/>
                   </pic:spPr>
@@ -1827,7 +1827,7 @@
           <w:color w:val="4B5563"/>
           <w:sz w:val="18"/>
         </w:rPr>
-        <w:t>Escola municipal — lugar de convivência e aprendizagem.</w:t>
+        <w:t>Frevo — manifestação cultural de Pernambuco.</w:t>
       </w:r>
     </w:p>
     <w:p>
@@ -1904,7 +1904,7 @@
           <w:color w:val="1B5E20"/>
           <w:sz w:val="22"/>
         </w:rPr>
-        <w:t>Questão 6 — O que é cultura</w:t>
+        <w:t>Questão 6 — Etnia e cultura</w:t>
       </w:r>
     </w:p>
     <w:p>
@@ -1918,7 +1918,61 @@
           <w:color w:val="1F2937"/>
           <w:sz w:val="22"/>
         </w:rPr>
-        <w:t>Escreva com suas palavras o que é cultura. Depois, dê um exemplo de manifestação cultural que você conhece na sua cidade ou bairro.</w:t>
+        <w:t>Escreva com suas palavras o que é etnia. Depois, observe a imagem e cite dois elementos culturais que podem ser identificados na roupa e no modo de vida das pessoas fotografadas.</w:t>
+      </w:r>
+    </w:p>
+    <w:p>
+      <w:pPr>
+        <w:jc w:val="center"/>
+      </w:pPr>
+      <w:r>
+        <w:drawing>
+          <wp:inline xmlns:a="http://schemas.openxmlformats.org/drawingml/2006/main" xmlns:pic="http://schemas.openxmlformats.org/drawingml/2006/picture">
+            <wp:extent cx="3960000" cy="6554625"/>
+            <wp:docPr id="6" name="Picture 6"/>
+            <wp:cNvGraphicFramePr>
+              <a:graphicFrameLocks noChangeAspect="1"/>
+            </wp:cNvGraphicFramePr>
+            <a:graphic>
+              <a:graphicData uri="http://schemas.openxmlformats.org/drawingml/2006/picture">
+                <pic:pic>
+                  <pic:nvPicPr>
+                    <pic:cNvPr id="0" name="image.jpg"/>
+                    <pic:cNvPicPr/>
+                  </pic:nvPicPr>
+                  <pic:blipFill>
+                    <a:blip r:embed="rId10"/>
+                    <a:stretch>
+                      <a:fillRect/>
+                    </a:stretch>
+                  </pic:blipFill>
+                  <pic:spPr>
+                    <a:xfrm>
+                      <a:off x="0" y="0"/>
+                      <a:ext cx="3960000" cy="6554625"/>
+                    </a:xfrm>
+                    <a:prstGeom prst="rect"/>
+                  </pic:spPr>
+                </pic:pic>
+              </a:graphicData>
+            </a:graphic>
+          </wp:inline>
+        </w:drawing>
+      </w:r>
+    </w:p>
+    <w:p>
+      <w:pPr>
+        <w:spacing w:after="160"/>
+        <w:jc w:val="center"/>
+      </w:pPr>
+      <w:r>
+        <w:rPr>
+          <w:rFonts w:ascii="Arial" w:hAnsi="Arial" w:eastAsia="Arial"/>
+          <w:b w:val="0"/>
+          <w:color w:val="4B5563"/>
+          <w:sz w:val="18"/>
+        </w:rPr>
+        <w:t>Povos de diferentes regiões têm trajes e costumes próprios.</w:t>
       </w:r>
     </w:p>
     <w:p>
@@ -1995,7 +2049,7 @@
           <w:color w:val="1B5E20"/>
           <w:sz w:val="22"/>
         </w:rPr>
-        <w:t>Questão 7 — Cultura entre gerações</w:t>
+        <w:t>Questão 7 — O que é cultura</w:t>
       </w:r>
     </w:p>
     <w:p>
@@ -2009,7 +2063,7 @@
           <w:color w:val="1F2937"/>
           <w:sz w:val="22"/>
         </w:rPr>
-        <w:t>Observe a imagem e escreva duas diferenças entre as brincadeiras ou hábitos culturais dos avós e os das crianças de hoje. Mencione também uma tradição que pode ser compartilhada entre as gerações.</w:t>
+        <w:t>De acordo com o livro, cite os quatro elementos que formam a cultura de um grupo (crenças, expressões artísticas, costumes e leis) e dê um exemplo de cada um.</w:t>
       </w:r>
     </w:p>
     <w:p>
@@ -2020,7 +2074,7 @@
         <w:drawing>
           <wp:inline xmlns:a="http://schemas.openxmlformats.org/drawingml/2006/main" xmlns:pic="http://schemas.openxmlformats.org/drawingml/2006/picture">
             <wp:extent cx="3960000" cy="5940000"/>
-            <wp:docPr id="6" name="Picture 6"/>
+            <wp:docPr id="7" name="Picture 7"/>
             <wp:cNvGraphicFramePr>
               <a:graphicFrameLocks noChangeAspect="1"/>
             </wp:cNvGraphicFramePr>
@@ -2032,7 +2086,7 @@
                     <pic:cNvPicPr/>
                   </pic:nvPicPr>
                   <pic:blipFill>
-                    <a:blip r:embed="rId11"/>
+                    <a:blip r:embed="rId13"/>
                     <a:stretch>
                       <a:fillRect/>
                     </a:stretch>
@@ -2063,7 +2117,160 @@
           <w:color w:val="4B5563"/>
           <w:sz w:val="18"/>
         </w:rPr>
-        <w:t>Avós, pais e crianças convivem e transmitem tradições.</w:t>
+        <w:t>Família reunida — exemplo de costume cultural.</w:t>
+      </w:r>
+    </w:p>
+    <w:p>
+      <w:pPr>
+        <w:spacing w:after="120"/>
+      </w:pPr>
+      <w:r>
+        <w:rPr>
+          <w:rFonts w:ascii="Arial" w:hAnsi="Arial" w:eastAsia="Arial"/>
+          <w:b/>
+          <w:color w:val="4B5563"/>
+          <w:sz w:val="22"/>
+        </w:rPr>
+        <w:t>Resposta:</w:t>
+      </w:r>
+    </w:p>
+    <w:p>
+      <w:pPr>
+        <w:spacing w:after="280"/>
+        <w:pBdr>
+          <w:bottom w:val="single" w:sz="6" w:space="1" w:color="B0B8C0"/>
+        </w:pBdr>
+      </w:pPr>
+    </w:p>
+    <w:p>
+      <w:pPr>
+        <w:spacing w:after="280"/>
+        <w:pBdr>
+          <w:bottom w:val="single" w:sz="6" w:space="1" w:color="B0B8C0"/>
+        </w:pBdr>
+      </w:pPr>
+    </w:p>
+    <w:p>
+      <w:pPr>
+        <w:spacing w:after="280"/>
+        <w:pBdr>
+          <w:bottom w:val="single" w:sz="6" w:space="1" w:color="B0B8C0"/>
+        </w:pBdr>
+      </w:pPr>
+    </w:p>
+    <w:p>
+      <w:pPr>
+        <w:spacing w:after="280"/>
+        <w:pBdr>
+          <w:bottom w:val="single" w:sz="6" w:space="1" w:color="B0B8C0"/>
+        </w:pBdr>
+      </w:pPr>
+    </w:p>
+    <w:p>
+      <w:pPr>
+        <w:spacing w:after="280"/>
+        <w:pBdr>
+          <w:bottom w:val="single" w:sz="6" w:space="1" w:color="B0B8C0"/>
+        </w:pBdr>
+      </w:pPr>
+    </w:p>
+    <w:p>
+      <w:pPr>
+        <w:spacing w:after="280"/>
+        <w:pBdr>
+          <w:bottom w:val="single" w:sz="6" w:space="1" w:color="B0B8C0"/>
+        </w:pBdr>
+      </w:pPr>
+    </w:p>
+    <w:p>
+      <w:pPr>
+        <w:spacing w:after="280"/>
+        <w:pBdr>
+          <w:bottom w:val="single" w:sz="6" w:space="1" w:color="B0B8C0"/>
+        </w:pBdr>
+      </w:pPr>
+    </w:p>
+    <w:p/>
+    <w:p>
+      <w:pPr>
+        <w:spacing w:after="80"/>
+      </w:pPr>
+      <w:r>
+        <w:rPr>
+          <w:rFonts w:ascii="Arial" w:hAnsi="Arial" w:eastAsia="Arial"/>
+          <w:b/>
+          <w:color w:val="1B5E20"/>
+          <w:sz w:val="22"/>
+        </w:rPr>
+        <w:t>Questão 8 — Cultura através das gerações</w:t>
+      </w:r>
+    </w:p>
+    <w:p>
+      <w:pPr>
+        <w:spacing w:after="160"/>
+      </w:pPr>
+      <w:r>
+        <w:rPr>
+          <w:rFonts w:ascii="Arial" w:hAnsi="Arial" w:eastAsia="Arial"/>
+          <w:b w:val="0"/>
+          <w:color w:val="1F2937"/>
+          <w:sz w:val="22"/>
+        </w:rPr>
+        <w:t>Observe a imagem das crianças brincando. Qual brincadeira está representada? Explique como aprendemos novas brincadeiras e por que elas fazem parte da cultura transmitida entre gerações.</w:t>
+      </w:r>
+    </w:p>
+    <w:p>
+      <w:pPr>
+        <w:jc w:val="center"/>
+      </w:pPr>
+      <w:r>
+        <w:drawing>
+          <wp:inline xmlns:a="http://schemas.openxmlformats.org/drawingml/2006/main" xmlns:pic="http://schemas.openxmlformats.org/drawingml/2006/picture">
+            <wp:extent cx="3960000" cy="2970000"/>
+            <wp:docPr id="8" name="Picture 8"/>
+            <wp:cNvGraphicFramePr>
+              <a:graphicFrameLocks noChangeAspect="1"/>
+            </wp:cNvGraphicFramePr>
+            <a:graphic>
+              <a:graphicData uri="http://schemas.openxmlformats.org/drawingml/2006/picture">
+                <pic:pic>
+                  <pic:nvPicPr>
+                    <pic:cNvPr id="0" name="image.jpg"/>
+                    <pic:cNvPicPr/>
+                  </pic:nvPicPr>
+                  <pic:blipFill>
+                    <a:blip r:embed="rId12"/>
+                    <a:stretch>
+                      <a:fillRect/>
+                    </a:stretch>
+                  </pic:blipFill>
+                  <pic:spPr>
+                    <a:xfrm>
+                      <a:off x="0" y="0"/>
+                      <a:ext cx="3960000" cy="2970000"/>
+                    </a:xfrm>
+                    <a:prstGeom prst="rect"/>
+                  </pic:spPr>
+                </pic:pic>
+              </a:graphicData>
+            </a:graphic>
+          </wp:inline>
+        </w:drawing>
+      </w:r>
+    </w:p>
+    <w:p>
+      <w:pPr>
+        <w:spacing w:after="160"/>
+        <w:jc w:val="center"/>
+      </w:pPr>
+      <w:r>
+        <w:rPr>
+          <w:rFonts w:ascii="Arial" w:hAnsi="Arial" w:eastAsia="Arial"/>
+          <w:b w:val="0"/>
+          <w:color w:val="4B5563"/>
+          <w:sz w:val="18"/>
+        </w:rPr>
+        <w:t>Brincadeiras de rua fazem parte da cultura infantil.</w:t>
       </w:r>
     </w:p>
     <w:p>
@@ -2140,7 +2347,7 @@
           <w:color w:val="1B5E20"/>
           <w:sz w:val="22"/>
         </w:rPr>
-        <w:t>Questão 8 — O que é cultura</w:t>
+        <w:t>Questão 9 — Cultura através das gerações</w:t>
       </w:r>
     </w:p>
     <w:p>
@@ -2154,61 +2361,7 @@
           <w:color w:val="1F2937"/>
           <w:sz w:val="22"/>
         </w:rPr>
-        <w:t>Observe a imagem da festa junina. Cite três elementos culturais visíveis ou relacionados a essa festa e explique o que cada um representa para a cultura brasileira.</w:t>
-      </w:r>
-    </w:p>
-    <w:p>
-      <w:pPr>
-        <w:jc w:val="center"/>
-      </w:pPr>
-      <w:r>
-        <w:drawing>
-          <wp:inline xmlns:a="http://schemas.openxmlformats.org/drawingml/2006/main" xmlns:pic="http://schemas.openxmlformats.org/drawingml/2006/picture">
-            <wp:extent cx="3960000" cy="2970000"/>
-            <wp:docPr id="7" name="Picture 7"/>
-            <wp:cNvGraphicFramePr>
-              <a:graphicFrameLocks noChangeAspect="1"/>
-            </wp:cNvGraphicFramePr>
-            <a:graphic>
-              <a:graphicData uri="http://schemas.openxmlformats.org/drawingml/2006/picture">
-                <pic:pic>
-                  <pic:nvPicPr>
-                    <pic:cNvPr id="0" name="image.jpg"/>
-                    <pic:cNvPicPr/>
-                  </pic:nvPicPr>
-                  <pic:blipFill>
-                    <a:blip r:embed="rId10"/>
-                    <a:stretch>
-                      <a:fillRect/>
-                    </a:stretch>
-                  </pic:blipFill>
-                  <pic:spPr>
-                    <a:xfrm>
-                      <a:off x="0" y="0"/>
-                      <a:ext cx="3960000" cy="2970000"/>
-                    </a:xfrm>
-                    <a:prstGeom prst="rect"/>
-                  </pic:spPr>
-                </pic:pic>
-              </a:graphicData>
-            </a:graphic>
-          </wp:inline>
-        </w:drawing>
-      </w:r>
-    </w:p>
-    <w:p>
-      <w:pPr>
-        <w:spacing w:after="160"/>
-        <w:jc w:val="center"/>
-      </w:pPr>
-      <w:r>
-        <w:rPr>
-          <w:rFonts w:ascii="Arial" w:hAnsi="Arial" w:eastAsia="Arial"/>
-          <w:b w:val="0"/>
-          <w:color w:val="4B5563"/>
-          <w:sz w:val="18"/>
-        </w:rPr>
-        <w:t>Dança típica em festa junina.</w:t>
+        <w:t>O livro diz que, em cidades, vilas, fazendas ou mata, todos somos brasileiros, mas cada comunidade tem sua cultura. Explique por que comunidades diferentes têm costumes e tradições distintos. Dê dois exemplos de manifestações culturais (como formas de plantar, preparar comida ou brincar).</w:t>
       </w:r>
     </w:p>
     <w:p>
@@ -2273,6 +2426,14 @@
         </w:pBdr>
       </w:pPr>
     </w:p>
+    <w:p>
+      <w:pPr>
+        <w:spacing w:after="280"/>
+        <w:pBdr>
+          <w:bottom w:val="single" w:sz="6" w:space="1" w:color="B0B8C0"/>
+        </w:pBdr>
+      </w:pPr>
+    </w:p>
     <w:p/>
     <w:p>
       <w:pPr>
@@ -2285,7 +2446,7 @@
           <w:color w:val="1B5E20"/>
           <w:sz w:val="22"/>
         </w:rPr>
-        <w:t>Questão 9 — Cultura brasileira urbana</w:t>
+        <w:t>Questão 10 — Cultura brasileira</w:t>
       </w:r>
     </w:p>
     <w:p>
@@ -2299,7 +2460,7 @@
           <w:color w:val="1F2937"/>
           <w:sz w:val="22"/>
         </w:rPr>
-        <w:t>Observe a imagem de um bloco de carnaval nas ruas de São Paulo. Descreva o que acontece nesse tipo de manifestação cultural e explique por que ela faz parte da cultura urbana brasileira.</w:t>
+        <w:t>Observe a imagem de pessoas com trajes tradicionais de outra região do mundo. Compare com a cultura brasileira: o que é semelhante e o que é diferente? Por que o livro afirma que nos sentimos pertencentes a uma comunidade?</w:t>
       </w:r>
     </w:p>
     <w:p>
@@ -2309,8 +2470,8 @@
       <w:r>
         <w:drawing>
           <wp:inline xmlns:a="http://schemas.openxmlformats.org/drawingml/2006/main" xmlns:pic="http://schemas.openxmlformats.org/drawingml/2006/picture">
-            <wp:extent cx="3960000" cy="2784375"/>
-            <wp:docPr id="8" name="Picture 8"/>
+            <wp:extent cx="3960000" cy="2842125"/>
+            <wp:docPr id="9" name="Picture 9"/>
             <wp:cNvGraphicFramePr>
               <a:graphicFrameLocks noChangeAspect="1"/>
             </wp:cNvGraphicFramePr>
@@ -2330,7 +2491,7 @@
                   <pic:spPr>
                     <a:xfrm>
                       <a:off x="0" y="0"/>
-                      <a:ext cx="3960000" cy="2784375"/>
+                      <a:ext cx="3960000" cy="2842125"/>
                     </a:xfrm>
                     <a:prstGeom prst="rect"/>
                   </pic:spPr>
@@ -2353,152 +2514,7 @@
           <w:color w:val="4B5563"/>
           <w:sz w:val="18"/>
         </w:rPr>
-        <w:t>Bloco de carnaval nas ruas de São Paulo.</w:t>
-      </w:r>
-    </w:p>
-    <w:p>
-      <w:pPr>
-        <w:spacing w:after="120"/>
-      </w:pPr>
-      <w:r>
-        <w:rPr>
-          <w:rFonts w:ascii="Arial" w:hAnsi="Arial" w:eastAsia="Arial"/>
-          <w:b/>
-          <w:color w:val="4B5563"/>
-          <w:sz w:val="22"/>
-        </w:rPr>
-        <w:t>Resposta:</w:t>
-      </w:r>
-    </w:p>
-    <w:p>
-      <w:pPr>
-        <w:spacing w:after="280"/>
-        <w:pBdr>
-          <w:bottom w:val="single" w:sz="6" w:space="1" w:color="B0B8C0"/>
-        </w:pBdr>
-      </w:pPr>
-    </w:p>
-    <w:p>
-      <w:pPr>
-        <w:spacing w:after="280"/>
-        <w:pBdr>
-          <w:bottom w:val="single" w:sz="6" w:space="1" w:color="B0B8C0"/>
-        </w:pBdr>
-      </w:pPr>
-    </w:p>
-    <w:p>
-      <w:pPr>
-        <w:spacing w:after="280"/>
-        <w:pBdr>
-          <w:bottom w:val="single" w:sz="6" w:space="1" w:color="B0B8C0"/>
-        </w:pBdr>
-      </w:pPr>
-    </w:p>
-    <w:p>
-      <w:pPr>
-        <w:spacing w:after="280"/>
-        <w:pBdr>
-          <w:bottom w:val="single" w:sz="6" w:space="1" w:color="B0B8C0"/>
-        </w:pBdr>
-      </w:pPr>
-    </w:p>
-    <w:p>
-      <w:pPr>
-        <w:spacing w:after="280"/>
-        <w:pBdr>
-          <w:bottom w:val="single" w:sz="6" w:space="1" w:color="B0B8C0"/>
-        </w:pBdr>
-      </w:pPr>
-    </w:p>
-    <w:p>
-      <w:pPr>
-        <w:spacing w:after="280"/>
-        <w:pBdr>
-          <w:bottom w:val="single" w:sz="6" w:space="1" w:color="B0B8C0"/>
-        </w:pBdr>
-      </w:pPr>
-    </w:p>
-    <w:p/>
-    <w:p>
-      <w:pPr>
-        <w:spacing w:after="80"/>
-      </w:pPr>
-      <w:r>
-        <w:rPr>
-          <w:rFonts w:ascii="Arial" w:hAnsi="Arial" w:eastAsia="Arial"/>
-          <w:b/>
-          <w:color w:val="1B5E20"/>
-          <w:sz w:val="22"/>
-        </w:rPr>
-        <w:t>Questão 10 — Cultura brasileira urbana</w:t>
-      </w:r>
-    </w:p>
-    <w:p>
-      <w:pPr>
-        <w:spacing w:after="160"/>
-      </w:pPr>
-      <w:r>
-        <w:rPr>
-          <w:rFonts w:ascii="Arial" w:hAnsi="Arial" w:eastAsia="Arial"/>
-          <w:b w:val="0"/>
-          <w:color w:val="1F2937"/>
-          <w:sz w:val="22"/>
-        </w:rPr>
-        <w:t>Cite três manifestações culturais urbanas do Brasil (como funk, grafite, samba, capoeira ou blocos de rua) e explique brevemente como cada uma se manifesta na cidade.</w:t>
-      </w:r>
-    </w:p>
-    <w:p>
-      <w:pPr>
-        <w:jc w:val="center"/>
-      </w:pPr>
-      <w:r>
-        <w:drawing>
-          <wp:inline xmlns:a="http://schemas.openxmlformats.org/drawingml/2006/main" xmlns:pic="http://schemas.openxmlformats.org/drawingml/2006/picture">
-            <wp:extent cx="3960000" cy="2970000"/>
-            <wp:docPr id="9" name="Picture 9"/>
-            <wp:cNvGraphicFramePr>
-              <a:graphicFrameLocks noChangeAspect="1"/>
-            </wp:cNvGraphicFramePr>
-            <a:graphic>
-              <a:graphicData uri="http://schemas.openxmlformats.org/drawingml/2006/picture">
-                <pic:pic>
-                  <pic:nvPicPr>
-                    <pic:cNvPr id="0" name="image.jpg"/>
-                    <pic:cNvPicPr/>
-                  </pic:nvPicPr>
-                  <pic:blipFill>
-                    <a:blip r:embed="rId12"/>
-                    <a:stretch>
-                      <a:fillRect/>
-                    </a:stretch>
-                  </pic:blipFill>
-                  <pic:spPr>
-                    <a:xfrm>
-                      <a:off x="0" y="0"/>
-                      <a:ext cx="3960000" cy="2970000"/>
-                    </a:xfrm>
-                    <a:prstGeom prst="rect"/>
-                  </pic:spPr>
-                </pic:pic>
-              </a:graphicData>
-            </a:graphic>
-          </wp:inline>
-        </w:drawing>
-      </w:r>
-    </w:p>
-    <w:p>
-      <w:pPr>
-        <w:spacing w:after="160"/>
-        <w:jc w:val="center"/>
-      </w:pPr>
-      <w:r>
-        <w:rPr>
-          <w:rFonts w:ascii="Arial" w:hAnsi="Arial" w:eastAsia="Arial"/>
-          <w:b w:val="0"/>
-          <w:color w:val="4B5563"/>
-          <w:sz w:val="18"/>
-        </w:rPr>
-        <w:t>Arte urbana em grande centro metropolitano.</w:t>
+        <w:t>Traje tradicional tuareg — diversidade cultural no mundo.</w:t>
       </w:r>
     </w:p>
     <w:p>

</xml_diff>